<commit_message>
First Commit: WebD Lab
</commit_message>
<xml_diff>
--- a/html/document of webd lab/Program No.docx
+++ b/html/document of webd lab/Program No.docx
@@ -264,7 +264,45 @@
           <w:szCs w:val="21"/>
           <w:lang w:eastAsia="en-IN"/>
         </w:rPr>
-        <w:t>    &lt;h1&gt;&lt;a href="https://www.linkedin.com/in/not-darshil-kumar/"&gt;Darshil&lt;/a&gt;&lt;/h1&gt;</w:t>
+        <w:t xml:space="preserve">    &lt;h1&gt;&lt;a </w:t>
+      </w:r>
+      <w:proofErr w:type="spellStart"/>
+      <w:r>
+        <w:rPr>
+          <w:rFonts w:ascii="Cascadia Code" w:eastAsia="Times New Roman" w:hAnsi="Cascadia Code" w:cs="Cascadia Code"/>
+          <w:sz w:val="21"/>
+          <w:szCs w:val="21"/>
+          <w:lang w:eastAsia="en-IN"/>
+        </w:rPr>
+        <w:t>href</w:t>
+      </w:r>
+      <w:proofErr w:type="spellEnd"/>
+      <w:r>
+        <w:rPr>
+          <w:rFonts w:ascii="Cascadia Code" w:eastAsia="Times New Roman" w:hAnsi="Cascadia Code" w:cs="Cascadia Code"/>
+          <w:sz w:val="21"/>
+          <w:szCs w:val="21"/>
+          <w:lang w:eastAsia="en-IN"/>
+        </w:rPr>
+        <w:t>="https://www.linkedin.com/in/not-darshil-kumar/"&gt;</w:t>
+      </w:r>
+      <w:r>
+        <w:rPr>
+          <w:rFonts w:ascii="Cascadia Code" w:eastAsia="Times New Roman" w:hAnsi="Cascadia Code" w:cs="Cascadia Code"/>
+          <w:sz w:val="21"/>
+          <w:szCs w:val="21"/>
+          <w:lang w:eastAsia="en-IN"/>
+        </w:rPr>
+        <w:t>Deepeanshu Malik</w:t>
+      </w:r>
+      <w:r>
+        <w:rPr>
+          <w:rFonts w:ascii="Cascadia Code" w:eastAsia="Times New Roman" w:hAnsi="Cascadia Code" w:cs="Cascadia Code"/>
+          <w:sz w:val="21"/>
+          <w:szCs w:val="21"/>
+          <w:lang w:eastAsia="en-IN"/>
+        </w:rPr>
+        <w:t>&lt;/a&gt;&lt;/h1&gt;</w:t>
       </w:r>
     </w:p>
     <w:p>
@@ -484,6 +522,7 @@
           <w:rFonts w:ascii="Cascadia Code" w:eastAsia="Times New Roman" w:hAnsi="Cascadia Code" w:cs="Cascadia Code"/>
           <w:b/>
           <w:bCs/>
+          <w:noProof/>
           <w:sz w:val="24"/>
           <w:szCs w:val="24"/>
           <w:lang w:eastAsia="en-IN"/>
@@ -1541,6 +1580,7 @@
           <w:rFonts w:ascii="Cascadia Code" w:eastAsia="Times New Roman" w:hAnsi="Cascadia Code" w:cs="Cascadia Code"/>
           <w:b/>
           <w:bCs/>
+          <w:noProof/>
           <w:sz w:val="24"/>
           <w:szCs w:val="24"/>
           <w:lang w:eastAsia="en-IN"/>

</xml_diff>